<commit_message>
Potenciometro PWM: verificacion en placa del ciclo con tension calibrada
El tope de la perilla lleva ahora el PWM al 100 % (antes 83,8 %) con la
misma lectura cruda; registro de la prueba y grafica en el informe.
</commit_message>
<xml_diff>
--- a/Potenciometro con salida PWM/docs/Informe_tecnico_Potenciometro_PWM_ESP32-C6.docx
+++ b/Potenciometro con salida PWM/docs/Informe_tecnico_Potenciometro_PWM_ESP32-C6.docx
@@ -5407,13 +5407,21 @@
             </w:pPr>
             <w:r>
               <w:rPr>
-                <w:i/>
-                <w:iCs/>
-                <w:color w:val="1A1A1A"/>
-                <w:sz w:val="19"/>
-                <w:szCs w:val="19"/>
-              </w:rPr>
-              <w:t xml:space="preserve">pendiente de medir</w:t>
+                <w:b/>
+                <w:bCs/>
+                <w:color w:val="1A1A1A"/>
+                <w:sz w:val="19"/>
+                <w:szCs w:val="19"/>
+              </w:rPr>
+              <w:t xml:space="preserve">Cumple.</w:t>
+            </w:r>
+            <w:r>
+              <w:rPr>
+                <w:color w:val="1A1A1A"/>
+                <w:sz w:val="19"/>
+                <w:szCs w:val="19"/>
+              </w:rPr>
+              <w:t xml:space="preserve"> 100,0 % en las 87 muestras tomadas en el tope, con la misma lectura cruda de antes (3429–3437)</w:t>
             </w:r>
           </w:p>
         </w:tc>
@@ -5490,7 +5498,7 @@
                 <w:sz w:val="19"/>
                 <w:szCs w:val="19"/>
               </w:rPr>
-              <w:t xml:space="preserve">El brillo recorre de apagado a máximo sin saltos</w:t>
+              <w:t xml:space="preserve">El ciclo recorre de 0 a 100 % sin saltos</w:t>
             </w:r>
           </w:p>
         </w:tc>
@@ -5510,13 +5518,132 @@
             </w:pPr>
             <w:r>
               <w:rPr>
-                <w:i/>
-                <w:iCs/>
-                <w:color w:val="1A1A1A"/>
-                <w:sz w:val="19"/>
-                <w:szCs w:val="19"/>
-              </w:rPr>
-              <w:t xml:space="preserve">pendiente de medir</w:t>
+                <w:b/>
+                <w:bCs/>
+                <w:color w:val="1A1A1A"/>
+                <w:sz w:val="19"/>
+                <w:szCs w:val="19"/>
+              </w:rPr>
+              <w:t xml:space="preserve">Cumple.</w:t>
+            </w:r>
+            <w:r>
+              <w:rPr>
+                <w:color w:val="1A1A1A"/>
+                <w:sz w:val="19"/>
+                <w:szCs w:val="19"/>
+              </w:rPr>
+              <w:t xml:space="preserve"> Pasa de forma continua por valores intermedios (6,9 → 36 → 47 → 79 → 100 %)</w:t>
+            </w:r>
+          </w:p>
+        </w:tc>
+      </w:tr>
+      <w:tr>
+        <w:trPr>
+          <w:tblHeader w:val="false"/>
+        </w:trPr>
+        <w:tc>
+          <w:tcPr>
+            <w:tcW w:type="dxa" w:w="2256"/>
+            <w:tcMar>
+              <w:top w:type="dxa" w:w="80"/>
+              <w:left w:type="dxa" w:w="110"/>
+              <w:bottom w:type="dxa" w:w="80"/>
+              <w:right w:type="dxa" w:w="110"/>
+            </w:tcMar>
+          </w:tcPr>
+          <w:p>
+            <w:pPr>
+              <w:spacing w:after="0"/>
+            </w:pPr>
+            <w:r>
+              <w:rPr>
+                <w:color w:val="1A1A1A"/>
+                <w:sz w:val="19"/>
+                <w:szCs w:val="19"/>
+              </w:rPr>
+              <w:t xml:space="preserve">C4</w:t>
+            </w:r>
+          </w:p>
+        </w:tc>
+        <w:tc>
+          <w:tcPr>
+            <w:tcW w:type="dxa" w:w="2256"/>
+            <w:tcMar>
+              <w:top w:type="dxa" w:w="80"/>
+              <w:left w:type="dxa" w:w="110"/>
+              <w:bottom w:type="dxa" w:w="80"/>
+              <w:right w:type="dxa" w:w="110"/>
+            </w:tcMar>
+          </w:tcPr>
+          <w:p>
+            <w:pPr>
+              <w:spacing w:after="0"/>
+            </w:pPr>
+            <w:r>
+              <w:rPr>
+                <w:color w:val="1A1A1A"/>
+                <w:sz w:val="19"/>
+                <w:szCs w:val="19"/>
+              </w:rPr>
+              <w:t xml:space="preserve">Perilla quieta a la mitad</w:t>
+            </w:r>
+          </w:p>
+        </w:tc>
+        <w:tc>
+          <w:tcPr>
+            <w:tcW w:type="dxa" w:w="2256"/>
+            <w:tcMar>
+              <w:top w:type="dxa" w:w="80"/>
+              <w:left w:type="dxa" w:w="110"/>
+              <w:bottom w:type="dxa" w:w="80"/>
+              <w:right w:type="dxa" w:w="110"/>
+            </w:tcMar>
+          </w:tcPr>
+          <w:p>
+            <w:pPr>
+              <w:spacing w:after="0"/>
+            </w:pPr>
+            <w:r>
+              <w:rPr>
+                <w:color w:val="1A1A1A"/>
+                <w:sz w:val="19"/>
+                <w:szCs w:val="19"/>
+              </w:rPr>
+              <w:t xml:space="preserve">Ciclo estable</w:t>
+            </w:r>
+          </w:p>
+        </w:tc>
+        <w:tc>
+          <w:tcPr>
+            <w:tcW w:type="dxa" w:w="2258"/>
+            <w:tcMar>
+              <w:top w:type="dxa" w:w="80"/>
+              <w:left w:type="dxa" w:w="110"/>
+              <w:bottom w:type="dxa" w:w="80"/>
+              <w:right w:type="dxa" w:w="110"/>
+            </w:tcMar>
+          </w:tcPr>
+          <w:p>
+            <w:pPr>
+              <w:spacing w:after="0"/>
+            </w:pPr>
+            <w:r>
+              <w:rPr>
+                <w:b/>
+                <w:bCs/>
+                <w:color w:val="1A1A1A"/>
+                <w:sz w:val="19"/>
+                <w:szCs w:val="19"/>
+              </w:rPr>
+              <w:t xml:space="preserve">Cumple.</w:t>
+            </w:r>
+            <w:r>
+              <w:rPr>
+                <w:color w:val="1A1A1A"/>
+                <w:sz w:val="19"/>
+                <w:szCs w:val="19"/>
+              </w:rPr>
+              <w:t xml:space="preserve"> 53,9–54,2 % durante 27 s (cursor a ~1,78 V)</w:t>
             </w:r>
           </w:p>
         </w:tc>
@@ -5526,6 +5653,128 @@
       <w:pPr>
         <w:spacing w:after="180"/>
       </w:pPr>
+    </w:p>
+    <w:p>
+      <w:pPr>
+        <w:spacing w:after="140"/>
+      </w:pPr>
+      <w:r>
+        <w:rPr>
+          <w:color w:val="1A1A1A"/>
+        </w:rPr>
+        <w:t xml:space="preserve">La verificación se grabó en </w:t>
+      </w:r>
+      <w:r>
+        <w:rPr>
+          <w:rFonts w:ascii="Consolas" w:cs="Consolas" w:eastAsia="Consolas" w:hAnsi="Consolas"/>
+          <w:color w:val="9A3412"/>
+          <w:sz w:val="19"/>
+          <w:szCs w:val="19"/>
+          <w:shd w:fill="F2F2EF" w:val="clear"/>
+        </w:rPr>
+        <w:t xml:space="preserve">monitor_verificacion_calibrado.txt</w:t>
+      </w:r>
+      <w:r>
+        <w:rPr>
+          <w:color w:val="1A1A1A"/>
+        </w:rPr>
+        <w:t xml:space="preserve">: un minuto en el que la perilla sube al tope, baja al mínimo, vuelve a subir y se deja a la mitad.</w:t>
+      </w:r>
+    </w:p>
+    <w:p>
+      <w:pPr>
+        <w:spacing w:after="60" w:before="160"/>
+        <w:jc w:val="center"/>
+      </w:pPr>
+      <w:r>
+        <w:drawing>
+          <wp:inline distT="0" distB="0" distL="0" distR="0">
+            <wp:extent cx="4457700" cy="1866900"/>
+            <wp:effectExtent t="0" r="0" b="0" l="0"/>
+            <wp:docPr id="1" name="" descr="" title=""/>
+            <wp:cNvGraphicFramePr>
+              <a:graphicFrameLocks xmlns:a="http://schemas.openxmlformats.org/drawingml/2006/main" noChangeAspect="1"/>
+            </wp:cNvGraphicFramePr>
+            <a:graphic xmlns:a="http://schemas.openxmlformats.org/drawingml/2006/main">
+              <a:graphicData uri="http://schemas.openxmlformats.org/drawingml/2006/picture">
+                <pic:pic xmlns:pic="http://schemas.openxmlformats.org/drawingml/2006/picture">
+                  <pic:nvPicPr>
+                    <pic:cNvPr id="0" name="" descr=""/>
+                    <pic:cNvPicPr>
+                      <a:picLocks noChangeAspect="1" noChangeArrowheads="1"/>
+                    </pic:cNvPicPr>
+                  </pic:nvPicPr>
+                  <pic:blipFill>
+                    <a:blip r:embed="rId12" cstate="none"/>
+                    <a:srcRect/>
+                    <a:stretch>
+                      <a:fillRect/>
+                    </a:stretch>
+                  </pic:blipFill>
+                  <pic:spPr bwMode="auto">
+                    <a:xfrm>
+                      <a:off x="0" y="0"/>
+                      <a:ext cx="4457700" cy="1866900"/>
+                    </a:xfrm>
+                    <a:prstGeom prst="rect">
+                      <a:avLst/>
+                    </a:prstGeom>
+                  </pic:spPr>
+                </pic:pic>
+              </a:graphicData>
+            </a:graphic>
+          </wp:inline>
+        </w:drawing>
+      </w:r>
+    </w:p>
+    <w:p>
+      <w:pPr>
+        <w:spacing w:after="220"/>
+        <w:jc w:val="center"/>
+      </w:pPr>
+      <w:r>
+        <w:rPr>
+          <w:i/>
+          <w:iCs/>
+          <w:color w:val="52514E"/>
+          <w:sz w:val="17"/>
+          <w:szCs w:val="17"/>
+        </w:rPr>
+        <w:t xml:space="preserve">Figura 5. Ciclo de trabajo con la versión final. La línea discontinua es el máximo que se alcanzaba con la lectura cruda</w:t>
+      </w:r>
+    </w:p>
+    <w:p>
+      <w:pPr>
+        <w:spacing w:after="140"/>
+      </w:pPr>
+      <w:r>
+        <w:rPr>
+          <w:b/>
+          <w:bCs/>
+          <w:color w:val="1A1A1A"/>
+        </w:rPr>
+        <w:t xml:space="preserve">Lectura.</w:t>
+      </w:r>
+      <w:r>
+        <w:rPr>
+          <w:color w:val="1A1A1A"/>
+        </w:rPr>
+        <w:t xml:space="preserve"> En la misma posición del tope, con la misma lectura cruda de ~3433, el ciclo de trabajo pasa del </w:t>
+      </w:r>
+      <w:r>
+        <w:rPr>
+          <w:b/>
+          <w:bCs/>
+          <w:color w:val="1A1A1A"/>
+        </w:rPr>
+        <w:t xml:space="preserve">83,8 % al 100 %</w:t>
+      </w:r>
+      <w:r>
+        <w:rPr>
+          <w:color w:val="1A1A1A"/>
+        </w:rPr>
+        <w:t xml:space="preserve">. El LED recorre ahora todo su rango de brillo. En la figura 5, toda la parte de la curva por encima de la línea discontinua es brillo que la primera versión no podía dar.</w:t>
+      </w:r>
     </w:p>
     <w:p>
       <w:pPr>
@@ -7040,7 +7289,21 @@
         <w:rPr>
           <w:color w:val="1A1A1A"/>
         </w:rPr>
-        <w:t xml:space="preserve">) para calcular el ciclo de trabajo. Con ella, el tope de la perilla lleva el PWM al 100 % en cualquier ESP32‑C6.</w:t>
+        <w:t xml:space="preserve">) para calcular el ciclo de trabajo. Verificado en la placa: en la misma posición del tope, el PWM pasa del 83,8 % al </w:t>
+      </w:r>
+      <w:r>
+        <w:rPr>
+          <w:b/>
+          <w:bCs/>
+          <w:color w:val="1A1A1A"/>
+        </w:rPr>
+        <w:t xml:space="preserve">100 %</w:t>
+      </w:r>
+      <w:r>
+        <w:rPr>
+          <w:color w:val="1A1A1A"/>
+        </w:rPr>
+        <w:t xml:space="preserve">, y el ciclo recorre todo el rango de forma continua. Al usar la calibración propia de cada chip, sirve en cualquier ESP32‑C6.</w:t>
       </w:r>
     </w:p>
     <w:p>
@@ -7225,7 +7488,7 @@
                 <w:sz w:val="17"/>
                 <w:szCs w:val="17"/>
               </w:rPr>
-              <w:t xml:space="preserve">python scripts/graficas_placa.py    # figuras 3 y 4, desde los registros de la placa</w:t>
+              <w:t xml:space="preserve">python scripts/graficas_placa.py    # figuras 3, 4 y 5, desde los registros de la placa</w:t>
             </w:r>
           </w:p>
           <w:p>

</xml_diff>

<commit_message>
Potenciometro PWM: fotos del montaje y del LED en el informe
</commit_message>
<xml_diff>
--- a/Potenciometro con salida PWM/docs/Informe_tecnico_Potenciometro_PWM_ESP32-C6.docx
+++ b/Potenciometro con salida PWM/docs/Informe_tecnico_Potenciometro_PWM_ESP32-C6.docx
@@ -6795,249 +6795,202 @@
         <w:t xml:space="preserve">5.7 Evidencias</w:t>
       </w:r>
     </w:p>
-    <w:tbl>
-      <w:tblPr>
-        <w:tblW w:type="dxa" w:w="9026"/>
-        <w:tblBorders>
-          <w:top w:val="single" w:color="E0A100" w:sz="2"/>
-          <w:left w:val="single" w:color="E0A100" w:sz="2"/>
-          <w:bottom w:val="single" w:color="E0A100" w:sz="2"/>
-          <w:right w:val="single" w:color="E0A100" w:sz="2"/>
-          <w:insideH w:val="single" w:color="E0A100" w:sz="2"/>
-          <w:insideV w:val="single" w:color="E0A100" w:sz="2"/>
-        </w:tblBorders>
-      </w:tblPr>
-      <w:tblGrid>
-        <w:gridCol w:w="9026"/>
-      </w:tblGrid>
-      <w:tr>
-        <w:tc>
-          <w:tcPr>
-            <w:tcW w:type="dxa" w:w="9026"/>
-            <w:shd w:fill="FFF8E1" w:val="clear"/>
-            <w:tcMar>
-              <w:top w:type="dxa" w:w="260"/>
-              <w:left w:type="dxa" w:w="200"/>
-              <w:bottom w:type="dxa" w:w="260"/>
-              <w:right w:type="dxa" w:w="200"/>
-            </w:tcMar>
-          </w:tcPr>
-          <w:p>
-            <w:pPr>
-              <w:jc w:val="center"/>
-            </w:pPr>
-            <w:r>
-              <w:rPr>
-                <w:b/>
-                <w:bCs/>
-                <w:color w:val="8A6100"/>
-              </w:rPr>
-              <w:t xml:space="preserve">EVIDENCIA PENDIENTE: Montaje en la protoboard</w:t>
-            </w:r>
-          </w:p>
-          <w:p>
-            <w:pPr>
-              <w:jc w:val="center"/>
-            </w:pPr>
-            <w:r>
-              <w:rPr>
-                <w:color w:val="8A6100"/>
-                <w:sz w:val="17"/>
-                <w:szCs w:val="17"/>
-              </w:rPr>
-              <w:t xml:space="preserve">docs/evidencias/foto_montaje.jpg</w:t>
-            </w:r>
-          </w:p>
-        </w:tc>
-      </w:tr>
-    </w:tbl>
     <w:p>
       <w:pPr>
-        <w:spacing w:after="180"/>
-      </w:pPr>
+        <w:spacing w:after="60" w:before="160"/>
+        <w:jc w:val="center"/>
+      </w:pPr>
+      <w:r>
+        <w:drawing>
+          <wp:inline distT="0" distB="0" distL="0" distR="0">
+            <wp:extent cx="1895475" cy="4000500"/>
+            <wp:effectExtent t="0" r="0" b="0" l="0"/>
+            <wp:docPr id="1" name="" descr="" title=""/>
+            <wp:cNvGraphicFramePr>
+              <a:graphicFrameLocks xmlns:a="http://schemas.openxmlformats.org/drawingml/2006/main" noChangeAspect="1"/>
+            </wp:cNvGraphicFramePr>
+            <a:graphic xmlns:a="http://schemas.openxmlformats.org/drawingml/2006/main">
+              <a:graphicData uri="http://schemas.openxmlformats.org/drawingml/2006/picture">
+                <pic:pic xmlns:pic="http://schemas.openxmlformats.org/drawingml/2006/picture">
+                  <pic:nvPicPr>
+                    <pic:cNvPr id="0" name="" descr=""/>
+                    <pic:cNvPicPr>
+                      <a:picLocks noChangeAspect="1" noChangeArrowheads="1"/>
+                    </pic:cNvPicPr>
+                  </pic:nvPicPr>
+                  <pic:blipFill>
+                    <a:blip r:embed="rId13" cstate="none"/>
+                    <a:srcRect/>
+                    <a:stretch>
+                      <a:fillRect/>
+                    </a:stretch>
+                  </pic:blipFill>
+                  <pic:spPr bwMode="auto">
+                    <a:xfrm>
+                      <a:off x="0" y="0"/>
+                      <a:ext cx="1895475" cy="4000500"/>
+                    </a:xfrm>
+                    <a:prstGeom prst="rect">
+                      <a:avLst/>
+                    </a:prstGeom>
+                  </pic:spPr>
+                </pic:pic>
+              </a:graphicData>
+            </a:graphic>
+          </wp:inline>
+        </w:drawing>
+      </w:r>
     </w:p>
-    <w:tbl>
-      <w:tblPr>
-        <w:tblW w:type="dxa" w:w="9026"/>
-        <w:tblBorders>
-          <w:top w:val="single" w:color="E0A100" w:sz="2"/>
-          <w:left w:val="single" w:color="E0A100" w:sz="2"/>
-          <w:bottom w:val="single" w:color="E0A100" w:sz="2"/>
-          <w:right w:val="single" w:color="E0A100" w:sz="2"/>
-          <w:insideH w:val="single" w:color="E0A100" w:sz="2"/>
-          <w:insideV w:val="single" w:color="E0A100" w:sz="2"/>
-        </w:tblBorders>
-      </w:tblPr>
-      <w:tblGrid>
-        <w:gridCol w:w="9026"/>
-      </w:tblGrid>
-      <w:tr>
-        <w:tc>
-          <w:tcPr>
-            <w:tcW w:type="dxa" w:w="9026"/>
-            <w:shd w:fill="FFF8E1" w:val="clear"/>
-            <w:tcMar>
-              <w:top w:type="dxa" w:w="260"/>
-              <w:left w:type="dxa" w:w="200"/>
-              <w:bottom w:type="dxa" w:w="260"/>
-              <w:right w:type="dxa" w:w="200"/>
-            </w:tcMar>
-          </w:tcPr>
-          <w:p>
-            <w:pPr>
-              <w:jc w:val="center"/>
-            </w:pPr>
-            <w:r>
-              <w:rPr>
-                <w:b/>
-                <w:bCs/>
-                <w:color w:val="8A6100"/>
-              </w:rPr>
-              <w:t xml:space="preserve">EVIDENCIA PENDIENTE: Perilla al mínimo: LED apagado</w:t>
-            </w:r>
-          </w:p>
-          <w:p>
-            <w:pPr>
-              <w:jc w:val="center"/>
-            </w:pPr>
-            <w:r>
-              <w:rPr>
-                <w:color w:val="8A6100"/>
-                <w:sz w:val="17"/>
-                <w:szCs w:val="17"/>
-              </w:rPr>
-              <w:t xml:space="preserve">docs/evidencias/foto_led_minimo.jpg</w:t>
-            </w:r>
-          </w:p>
-        </w:tc>
-      </w:tr>
-    </w:tbl>
     <w:p>
       <w:pPr>
-        <w:spacing w:after="180"/>
-      </w:pPr>
+        <w:spacing w:after="220"/>
+        <w:jc w:val="center"/>
+      </w:pPr>
+      <w:r>
+        <w:rPr>
+          <w:i/>
+          <w:iCs/>
+          <w:color w:val="52514E"/>
+          <w:sz w:val="17"/>
+          <w:szCs w:val="17"/>
+        </w:rPr>
+        <w:t xml:space="preserve">Montaje en la protoboard, vista superior: potenciómetro, módulo LED RGB y placa ESP32-C6 conectada por el conector CH343 (UART)</w:t>
+      </w:r>
     </w:p>
-    <w:tbl>
-      <w:tblPr>
-        <w:tblW w:type="dxa" w:w="9026"/>
-        <w:tblBorders>
-          <w:top w:val="single" w:color="E0A100" w:sz="2"/>
-          <w:left w:val="single" w:color="E0A100" w:sz="2"/>
-          <w:bottom w:val="single" w:color="E0A100" w:sz="2"/>
-          <w:right w:val="single" w:color="E0A100" w:sz="2"/>
-          <w:insideH w:val="single" w:color="E0A100" w:sz="2"/>
-          <w:insideV w:val="single" w:color="E0A100" w:sz="2"/>
-        </w:tblBorders>
-      </w:tblPr>
-      <w:tblGrid>
-        <w:gridCol w:w="9026"/>
-      </w:tblGrid>
-      <w:tr>
-        <w:tc>
-          <w:tcPr>
-            <w:tcW w:type="dxa" w:w="9026"/>
-            <w:shd w:fill="FFF8E1" w:val="clear"/>
-            <w:tcMar>
-              <w:top w:type="dxa" w:w="260"/>
-              <w:left w:type="dxa" w:w="200"/>
-              <w:bottom w:type="dxa" w:w="260"/>
-              <w:right w:type="dxa" w:w="200"/>
-            </w:tcMar>
-          </w:tcPr>
-          <w:p>
-            <w:pPr>
-              <w:jc w:val="center"/>
-            </w:pPr>
-            <w:r>
-              <w:rPr>
-                <w:b/>
-                <w:bCs/>
-                <w:color w:val="8A6100"/>
-              </w:rPr>
-              <w:t xml:space="preserve">EVIDENCIA PENDIENTE: Perilla a la mitad: brillo intermedio</w:t>
-            </w:r>
-          </w:p>
-          <w:p>
-            <w:pPr>
-              <w:jc w:val="center"/>
-            </w:pPr>
-            <w:r>
-              <w:rPr>
-                <w:color w:val="8A6100"/>
-                <w:sz w:val="17"/>
-                <w:szCs w:val="17"/>
-              </w:rPr>
-              <w:t xml:space="preserve">docs/evidencias/foto_led_medio.jpg</w:t>
-            </w:r>
-          </w:p>
-        </w:tc>
-      </w:tr>
-    </w:tbl>
     <w:p>
       <w:pPr>
-        <w:spacing w:after="180"/>
-      </w:pPr>
+        <w:spacing w:after="60" w:before="160"/>
+        <w:jc w:val="center"/>
+      </w:pPr>
+      <w:r>
+        <w:drawing>
+          <wp:inline distT="0" distB="0" distL="0" distR="0">
+            <wp:extent cx="1895475" cy="4000500"/>
+            <wp:effectExtent t="0" r="0" b="0" l="0"/>
+            <wp:docPr id="1" name="" descr="" title=""/>
+            <wp:cNvGraphicFramePr>
+              <a:graphicFrameLocks xmlns:a="http://schemas.openxmlformats.org/drawingml/2006/main" noChangeAspect="1"/>
+            </wp:cNvGraphicFramePr>
+            <a:graphic xmlns:a="http://schemas.openxmlformats.org/drawingml/2006/main">
+              <a:graphicData uri="http://schemas.openxmlformats.org/drawingml/2006/picture">
+                <pic:pic xmlns:pic="http://schemas.openxmlformats.org/drawingml/2006/picture">
+                  <pic:nvPicPr>
+                    <pic:cNvPr id="0" name="" descr=""/>
+                    <pic:cNvPicPr>
+                      <a:picLocks noChangeAspect="1" noChangeArrowheads="1"/>
+                    </pic:cNvPicPr>
+                  </pic:nvPicPr>
+                  <pic:blipFill>
+                    <a:blip r:embed="rId14" cstate="none"/>
+                    <a:srcRect/>
+                    <a:stretch>
+                      <a:fillRect/>
+                    </a:stretch>
+                  </pic:blipFill>
+                  <pic:spPr bwMode="auto">
+                    <a:xfrm>
+                      <a:off x="0" y="0"/>
+                      <a:ext cx="1895475" cy="4000500"/>
+                    </a:xfrm>
+                    <a:prstGeom prst="rect">
+                      <a:avLst/>
+                    </a:prstGeom>
+                  </pic:spPr>
+                </pic:pic>
+              </a:graphicData>
+            </a:graphic>
+          </wp:inline>
+        </w:drawing>
+      </w:r>
     </w:p>
-    <w:tbl>
-      <w:tblPr>
-        <w:tblW w:type="dxa" w:w="9026"/>
-        <w:tblBorders>
-          <w:top w:val="single" w:color="E0A100" w:sz="2"/>
-          <w:left w:val="single" w:color="E0A100" w:sz="2"/>
-          <w:bottom w:val="single" w:color="E0A100" w:sz="2"/>
-          <w:right w:val="single" w:color="E0A100" w:sz="2"/>
-          <w:insideH w:val="single" w:color="E0A100" w:sz="2"/>
-          <w:insideV w:val="single" w:color="E0A100" w:sz="2"/>
-        </w:tblBorders>
-      </w:tblPr>
-      <w:tblGrid>
-        <w:gridCol w:w="9026"/>
-      </w:tblGrid>
-      <w:tr>
-        <w:tc>
-          <w:tcPr>
-            <w:tcW w:type="dxa" w:w="9026"/>
-            <w:shd w:fill="FFF8E1" w:val="clear"/>
-            <w:tcMar>
-              <w:top w:type="dxa" w:w="260"/>
-              <w:left w:type="dxa" w:w="200"/>
-              <w:bottom w:type="dxa" w:w="260"/>
-              <w:right w:type="dxa" w:w="200"/>
-            </w:tcMar>
-          </w:tcPr>
-          <w:p>
-            <w:pPr>
-              <w:jc w:val="center"/>
-            </w:pPr>
-            <w:r>
-              <w:rPr>
-                <w:b/>
-                <w:bCs/>
-                <w:color w:val="8A6100"/>
-              </w:rPr>
-              <w:t xml:space="preserve">EVIDENCIA PENDIENTE: Perilla al máximo: LED a pleno brillo</w:t>
-            </w:r>
-          </w:p>
-          <w:p>
-            <w:pPr>
-              <w:jc w:val="center"/>
-            </w:pPr>
-            <w:r>
-              <w:rPr>
-                <w:color w:val="8A6100"/>
-                <w:sz w:val="17"/>
-                <w:szCs w:val="17"/>
-              </w:rPr>
-              <w:t xml:space="preserve">docs/evidencias/foto_led_maximo.jpg</w:t>
-            </w:r>
-          </w:p>
-        </w:tc>
-      </w:tr>
-    </w:tbl>
     <w:p>
       <w:pPr>
-        <w:spacing w:after="180"/>
-      </w:pPr>
+        <w:spacing w:after="220"/>
+        <w:jc w:val="center"/>
+      </w:pPr>
+      <w:r>
+        <w:rPr>
+          <w:i/>
+          <w:iCs/>
+          <w:color w:val="52514E"/>
+          <w:sz w:val="17"/>
+          <w:szCs w:val="17"/>
+        </w:rPr>
+        <w:t xml:space="preserve">LED verde encendido, con el brillo regulado por el potenciómetro (primera posición de la perilla)</w:t>
+      </w:r>
+    </w:p>
+    <w:p>
+      <w:pPr>
+        <w:spacing w:after="60" w:before="160"/>
+        <w:jc w:val="center"/>
+      </w:pPr>
+      <w:r>
+        <w:drawing>
+          <wp:inline distT="0" distB="0" distL="0" distR="0">
+            <wp:extent cx="1895475" cy="4000500"/>
+            <wp:effectExtent t="0" r="0" b="0" l="0"/>
+            <wp:docPr id="1" name="" descr="" title=""/>
+            <wp:cNvGraphicFramePr>
+              <a:graphicFrameLocks xmlns:a="http://schemas.openxmlformats.org/drawingml/2006/main" noChangeAspect="1"/>
+            </wp:cNvGraphicFramePr>
+            <a:graphic xmlns:a="http://schemas.openxmlformats.org/drawingml/2006/main">
+              <a:graphicData uri="http://schemas.openxmlformats.org/drawingml/2006/picture">
+                <pic:pic xmlns:pic="http://schemas.openxmlformats.org/drawingml/2006/picture">
+                  <pic:nvPicPr>
+                    <pic:cNvPr id="0" name="" descr=""/>
+                    <pic:cNvPicPr>
+                      <a:picLocks noChangeAspect="1" noChangeArrowheads="1"/>
+                    </pic:cNvPicPr>
+                  </pic:nvPicPr>
+                  <pic:blipFill>
+                    <a:blip r:embed="rId15" cstate="none"/>
+                    <a:srcRect/>
+                    <a:stretch>
+                      <a:fillRect/>
+                    </a:stretch>
+                  </pic:blipFill>
+                  <pic:spPr bwMode="auto">
+                    <a:xfrm>
+                      <a:off x="0" y="0"/>
+                      <a:ext cx="1895475" cy="4000500"/>
+                    </a:xfrm>
+                    <a:prstGeom prst="rect">
+                      <a:avLst/>
+                    </a:prstGeom>
+                  </pic:spPr>
+                </pic:pic>
+              </a:graphicData>
+            </a:graphic>
+          </wp:inline>
+        </w:drawing>
+      </w:r>
+    </w:p>
+    <w:p>
+      <w:pPr>
+        <w:spacing w:after="220"/>
+        <w:jc w:val="center"/>
+      </w:pPr>
+      <w:r>
+        <w:rPr>
+          <w:i/>
+          <w:iCs/>
+          <w:color w:val="52514E"/>
+          <w:sz w:val="17"/>
+          <w:szCs w:val="17"/>
+        </w:rPr>
+        <w:t xml:space="preserve">LED verde encendido, con el brillo regulado por el potenciómetro (segunda posición de la perilla)</w:t>
+      </w:r>
+    </w:p>
+    <w:p>
+      <w:pPr>
+        <w:spacing w:after="140"/>
+      </w:pPr>
+      <w:r>
+        <w:rPr>
+          <w:color w:val="1A1A1A"/>
+        </w:rPr>
+        <w:t xml:space="preserve">Las dos fotos del LED se tomaron a oscuras con distintas posiciones de la perilla. El teléfono ajusta la exposición automáticamente, así que las fotos no sirven para comparar brillos. Los valores de ciclo de trabajo de cada posición son los medidos en 5.2 y 5.4.</w:t>
+      </w:r>
     </w:p>
     <w:p>
       <w:pPr>

</xml_diff>